<commit_message>
Amend PL/SQL tips section of dev guide
</commit_message>
<xml_diff>
--- a/documentation/Developer Guide.docx
+++ b/documentation/Developer Guide.docx
@@ -301,6 +301,15 @@
     </w:sdt>
     <w:sdt>
       <w:sdtPr>
+        <w:rPr>
+          <w:rFonts w:asciiTheme="minorHAnsi" w:eastAsiaTheme="minorHAnsi" w:hAnsiTheme="minorHAnsi" w:cstheme="minorBidi"/>
+          <w:color w:val="auto"/>
+          <w:kern w:val="2"/>
+          <w:sz w:val="22"/>
+          <w:szCs w:val="22"/>
+          <w:lang w:val="en-GB"/>
+          <w14:ligatures w14:val="standardContextual"/>
+        </w:rPr>
         <w:id w:val="-999804463"/>
         <w:docPartObj>
           <w:docPartGallery w:val="Table of Contents"/>
@@ -309,16 +318,9 @@
       </w:sdtPr>
       <w:sdtEndPr>
         <w:rPr>
-          <w:rFonts w:asciiTheme="minorHAnsi" w:eastAsiaTheme="minorHAnsi" w:hAnsiTheme="minorHAnsi" w:cstheme="minorBidi"/>
           <w:b/>
           <w:bCs/>
           <w:noProof/>
-          <w:color w:val="auto"/>
-          <w:kern w:val="2"/>
-          <w:sz w:val="22"/>
-          <w:szCs w:val="22"/>
-          <w:lang w:val="en-GB"/>
-          <w14:ligatures w14:val="standardContextual"/>
         </w:rPr>
       </w:sdtEndPr>
       <w:sdtContent>
@@ -353,7 +355,7 @@
           <w:r>
             <w:fldChar w:fldCharType="separate"/>
           </w:r>
-          <w:hyperlink w:anchor="_Toc229777981" w:history="1">
+          <w:hyperlink w:anchor="_Toc229823802" w:history="1">
             <w:r>
               <w:rPr>
                 <w:rStyle w:val="Hyperlink"/>
@@ -380,7 +382,7 @@
                 <w:noProof/>
                 <w:webHidden/>
               </w:rPr>
-              <w:instrText xml:space="preserve"> PAGEREF _Toc229777981 \h </w:instrText>
+              <w:instrText xml:space="preserve"> PAGEREF _Toc229823802 \h </w:instrText>
             </w:r>
             <w:r>
               <w:rPr>
@@ -425,7 +427,7 @@
               <w:lang w:eastAsia="en-GB"/>
             </w:rPr>
           </w:pPr>
-          <w:hyperlink w:anchor="_Toc229777982" w:history="1">
+          <w:hyperlink w:anchor="_Toc229823803" w:history="1">
             <w:r>
               <w:rPr>
                 <w:rStyle w:val="Hyperlink"/>
@@ -452,7 +454,7 @@
                 <w:noProof/>
                 <w:webHidden/>
               </w:rPr>
-              <w:instrText xml:space="preserve"> PAGEREF _Toc229777982 \h </w:instrText>
+              <w:instrText xml:space="preserve"> PAGEREF _Toc229823803 \h </w:instrText>
             </w:r>
             <w:r>
               <w:rPr>
@@ -497,7 +499,7 @@
               <w:lang w:eastAsia="en-GB"/>
             </w:rPr>
           </w:pPr>
-          <w:hyperlink w:anchor="_Toc229777983" w:history="1">
+          <w:hyperlink w:anchor="_Toc229823804" w:history="1">
             <w:r>
               <w:rPr>
                 <w:rStyle w:val="Hyperlink"/>
@@ -524,7 +526,7 @@
                 <w:noProof/>
                 <w:webHidden/>
               </w:rPr>
-              <w:instrText xml:space="preserve"> PAGEREF _Toc229777983 \h </w:instrText>
+              <w:instrText xml:space="preserve"> PAGEREF _Toc229823804 \h </w:instrText>
             </w:r>
             <w:r>
               <w:rPr>
@@ -569,7 +571,7 @@
               <w:lang w:eastAsia="en-GB"/>
             </w:rPr>
           </w:pPr>
-          <w:hyperlink w:anchor="_Toc229777984" w:history="1">
+          <w:hyperlink w:anchor="_Toc229823805" w:history="1">
             <w:r>
               <w:rPr>
                 <w:rStyle w:val="Hyperlink"/>
@@ -596,7 +598,7 @@
                 <w:noProof/>
                 <w:webHidden/>
               </w:rPr>
-              <w:instrText xml:space="preserve"> PAGEREF _Toc229777984 \h </w:instrText>
+              <w:instrText xml:space="preserve"> PAGEREF _Toc229823805 \h </w:instrText>
             </w:r>
             <w:r>
               <w:rPr>
@@ -641,7 +643,7 @@
               <w:lang w:eastAsia="en-GB"/>
             </w:rPr>
           </w:pPr>
-          <w:hyperlink w:anchor="_Toc229777985" w:history="1">
+          <w:hyperlink w:anchor="_Toc229823806" w:history="1">
             <w:r>
               <w:rPr>
                 <w:rStyle w:val="Hyperlink"/>
@@ -668,7 +670,7 @@
                 <w:noProof/>
                 <w:webHidden/>
               </w:rPr>
-              <w:instrText xml:space="preserve"> PAGEREF _Toc229777985 \h </w:instrText>
+              <w:instrText xml:space="preserve"> PAGEREF _Toc229823806 \h </w:instrText>
             </w:r>
             <w:r>
               <w:rPr>
@@ -713,7 +715,7 @@
               <w:lang w:eastAsia="en-GB"/>
             </w:rPr>
           </w:pPr>
-          <w:hyperlink w:anchor="_Toc229777986" w:history="1">
+          <w:hyperlink w:anchor="_Toc229823807" w:history="1">
             <w:r>
               <w:rPr>
                 <w:rStyle w:val="Hyperlink"/>
@@ -740,7 +742,7 @@
                 <w:noProof/>
                 <w:webHidden/>
               </w:rPr>
-              <w:instrText xml:space="preserve"> PAGEREF _Toc229777986 \h </w:instrText>
+              <w:instrText xml:space="preserve"> PAGEREF _Toc229823807 \h </w:instrText>
             </w:r>
             <w:r>
               <w:rPr>
@@ -785,7 +787,7 @@
               <w:lang w:eastAsia="en-GB"/>
             </w:rPr>
           </w:pPr>
-          <w:hyperlink w:anchor="_Toc229777987" w:history="1">
+          <w:hyperlink w:anchor="_Toc229823808" w:history="1">
             <w:r>
               <w:rPr>
                 <w:rStyle w:val="Hyperlink"/>
@@ -812,7 +814,7 @@
                 <w:noProof/>
                 <w:webHidden/>
               </w:rPr>
-              <w:instrText xml:space="preserve"> PAGEREF _Toc229777987 \h </w:instrText>
+              <w:instrText xml:space="preserve"> PAGEREF _Toc229823808 \h </w:instrText>
             </w:r>
             <w:r>
               <w:rPr>
@@ -857,7 +859,7 @@
               <w:lang w:eastAsia="en-GB"/>
             </w:rPr>
           </w:pPr>
-          <w:hyperlink w:anchor="_Toc229777988" w:history="1">
+          <w:hyperlink w:anchor="_Toc229823809" w:history="1">
             <w:r>
               <w:rPr>
                 <w:rStyle w:val="Hyperlink"/>
@@ -884,7 +886,7 @@
                 <w:noProof/>
                 <w:webHidden/>
               </w:rPr>
-              <w:instrText xml:space="preserve"> PAGEREF _Toc229777988 \h </w:instrText>
+              <w:instrText xml:space="preserve"> PAGEREF _Toc229823809 \h </w:instrText>
             </w:r>
             <w:r>
               <w:rPr>
@@ -929,7 +931,7 @@
               <w:lang w:eastAsia="en-GB"/>
             </w:rPr>
           </w:pPr>
-          <w:hyperlink w:anchor="_Toc229777989" w:history="1">
+          <w:hyperlink w:anchor="_Toc229823810" w:history="1">
             <w:r>
               <w:rPr>
                 <w:rStyle w:val="Hyperlink"/>
@@ -956,7 +958,7 @@
                 <w:noProof/>
                 <w:webHidden/>
               </w:rPr>
-              <w:instrText xml:space="preserve"> PAGEREF _Toc229777989 \h </w:instrText>
+              <w:instrText xml:space="preserve"> PAGEREF _Toc229823810 \h </w:instrText>
             </w:r>
             <w:r>
               <w:rPr>
@@ -989,7 +991,7 @@
         </w:p>
         <w:p>
           <w:pPr>
-            <w:pStyle w:val="TOC2"/>
+            <w:pStyle w:val="TOC3"/>
             <w:tabs>
               <w:tab w:val="right" w:leader="dot" w:pos="9016"/>
             </w:tabs>
@@ -1001,7 +1003,7 @@
               <w:lang w:eastAsia="en-GB"/>
             </w:rPr>
           </w:pPr>
-          <w:hyperlink w:anchor="_Toc229777990" w:history="1">
+          <w:hyperlink w:anchor="_Toc229823811" w:history="1">
             <w:r>
               <w:rPr>
                 <w:rStyle w:val="Hyperlink"/>
@@ -1028,7 +1030,7 @@
                 <w:noProof/>
                 <w:webHidden/>
               </w:rPr>
-              <w:instrText xml:space="preserve"> PAGEREF _Toc229777990 \h </w:instrText>
+              <w:instrText xml:space="preserve"> PAGEREF _Toc229823811 \h </w:instrText>
             </w:r>
             <w:r>
               <w:rPr>
@@ -1061,7 +1063,7 @@
         </w:p>
         <w:p>
           <w:pPr>
-            <w:pStyle w:val="TOC2"/>
+            <w:pStyle w:val="TOC3"/>
             <w:tabs>
               <w:tab w:val="right" w:leader="dot" w:pos="9016"/>
             </w:tabs>
@@ -1073,7 +1075,7 @@
               <w:lang w:eastAsia="en-GB"/>
             </w:rPr>
           </w:pPr>
-          <w:hyperlink w:anchor="_Toc229777991" w:history="1">
+          <w:hyperlink w:anchor="_Toc229823812" w:history="1">
             <w:r>
               <w:rPr>
                 <w:rStyle w:val="Hyperlink"/>
@@ -1100,7 +1102,7 @@
                 <w:noProof/>
                 <w:webHidden/>
               </w:rPr>
-              <w:instrText xml:space="preserve"> PAGEREF _Toc229777991 \h </w:instrText>
+              <w:instrText xml:space="preserve"> PAGEREF _Toc229823812 \h </w:instrText>
             </w:r>
             <w:r>
               <w:rPr>
@@ -1133,7 +1135,7 @@
         </w:p>
         <w:p>
           <w:pPr>
-            <w:pStyle w:val="TOC2"/>
+            <w:pStyle w:val="TOC3"/>
             <w:tabs>
               <w:tab w:val="right" w:leader="dot" w:pos="9016"/>
             </w:tabs>
@@ -1145,7 +1147,7 @@
               <w:lang w:eastAsia="en-GB"/>
             </w:rPr>
           </w:pPr>
-          <w:hyperlink w:anchor="_Toc229777992" w:history="1">
+          <w:hyperlink w:anchor="_Toc229823813" w:history="1">
             <w:r>
               <w:rPr>
                 <w:rStyle w:val="Hyperlink"/>
@@ -1172,7 +1174,7 @@
                 <w:noProof/>
                 <w:webHidden/>
               </w:rPr>
-              <w:instrText xml:space="preserve"> PAGEREF _Toc229777992 \h </w:instrText>
+              <w:instrText xml:space="preserve"> PAGEREF _Toc229823813 \h </w:instrText>
             </w:r>
             <w:r>
               <w:rPr>
@@ -1205,7 +1207,7 @@
         </w:p>
         <w:p>
           <w:pPr>
-            <w:pStyle w:val="TOC2"/>
+            <w:pStyle w:val="TOC3"/>
             <w:tabs>
               <w:tab w:val="right" w:leader="dot" w:pos="9016"/>
             </w:tabs>
@@ -1217,7 +1219,7 @@
               <w:lang w:eastAsia="en-GB"/>
             </w:rPr>
           </w:pPr>
-          <w:hyperlink w:anchor="_Toc229777993" w:history="1">
+          <w:hyperlink w:anchor="_Toc229823814" w:history="1">
             <w:r>
               <w:rPr>
                 <w:rStyle w:val="Hyperlink"/>
@@ -1244,7 +1246,7 @@
                 <w:noProof/>
                 <w:webHidden/>
               </w:rPr>
-              <w:instrText xml:space="preserve"> PAGEREF _Toc229777993 \h </w:instrText>
+              <w:instrText xml:space="preserve"> PAGEREF _Toc229823814 \h </w:instrText>
             </w:r>
             <w:r>
               <w:rPr>
@@ -1277,7 +1279,7 @@
         </w:p>
         <w:p>
           <w:pPr>
-            <w:pStyle w:val="TOC3"/>
+            <w:pStyle w:val="TOC1"/>
             <w:tabs>
               <w:tab w:val="right" w:leader="dot" w:pos="9016"/>
             </w:tabs>
@@ -1289,13 +1291,13 @@
               <w:lang w:eastAsia="en-GB"/>
             </w:rPr>
           </w:pPr>
-          <w:hyperlink w:anchor="_Toc229777994" w:history="1">
+          <w:hyperlink w:anchor="_Toc229823815" w:history="1">
             <w:r>
               <w:rPr>
                 <w:rStyle w:val="Hyperlink"/>
                 <w:noProof/>
               </w:rPr>
-              <w:t>Bulk Collect versus Cursor For Loops</w:t>
+              <w:t>Version Control</w:t>
             </w:r>
             <w:r>
               <w:rPr>
@@ -1316,7 +1318,7 @@
                 <w:noProof/>
                 <w:webHidden/>
               </w:rPr>
-              <w:instrText xml:space="preserve"> PAGEREF _Toc229777994 \h </w:instrText>
+              <w:instrText xml:space="preserve"> PAGEREF _Toc229823815 \h </w:instrText>
             </w:r>
             <w:r>
               <w:rPr>
@@ -1336,7 +1338,7 @@
                 <w:noProof/>
                 <w:webHidden/>
               </w:rPr>
-              <w:t>8</w:t>
+              <w:t>10</w:t>
             </w:r>
             <w:r>
               <w:rPr>
@@ -1349,7 +1351,7 @@
         </w:p>
         <w:p>
           <w:pPr>
-            <w:pStyle w:val="TOC3"/>
+            <w:pStyle w:val="TOC1"/>
             <w:tabs>
               <w:tab w:val="right" w:leader="dot" w:pos="9016"/>
             </w:tabs>
@@ -1361,13 +1363,13 @@
               <w:lang w:eastAsia="en-GB"/>
             </w:rPr>
           </w:pPr>
-          <w:hyperlink w:anchor="_Toc229777995" w:history="1">
+          <w:hyperlink w:anchor="_Toc229823816" w:history="1">
             <w:r>
               <w:rPr>
                 <w:rStyle w:val="Hyperlink"/>
                 <w:noProof/>
               </w:rPr>
-              <w:t>Cursors</w:t>
+              <w:t>Adding Functionality</w:t>
             </w:r>
             <w:r>
               <w:rPr>
@@ -1388,7 +1390,7 @@
                 <w:noProof/>
                 <w:webHidden/>
               </w:rPr>
-              <w:instrText xml:space="preserve"> PAGEREF _Toc229777995 \h </w:instrText>
+              <w:instrText xml:space="preserve"> PAGEREF _Toc229823816 \h </w:instrText>
             </w:r>
             <w:r>
               <w:rPr>
@@ -1408,7 +1410,7 @@
                 <w:noProof/>
                 <w:webHidden/>
               </w:rPr>
-              <w:t>9</w:t>
+              <w:t>11</w:t>
             </w:r>
             <w:r>
               <w:rPr>
@@ -1421,7 +1423,7 @@
         </w:p>
         <w:p>
           <w:pPr>
-            <w:pStyle w:val="TOC1"/>
+            <w:pStyle w:val="TOC2"/>
             <w:tabs>
               <w:tab w:val="right" w:leader="dot" w:pos="9016"/>
             </w:tabs>
@@ -1433,13 +1435,13 @@
               <w:lang w:eastAsia="en-GB"/>
             </w:rPr>
           </w:pPr>
-          <w:hyperlink w:anchor="_Toc229777996" w:history="1">
+          <w:hyperlink w:anchor="_Toc229823817" w:history="1">
             <w:r>
               <w:rPr>
                 <w:rStyle w:val="Hyperlink"/>
                 <w:noProof/>
               </w:rPr>
-              <w:t>Version Control</w:t>
+              <w:t>Database Objects</w:t>
             </w:r>
             <w:r>
               <w:rPr>
@@ -1460,7 +1462,7 @@
                 <w:noProof/>
                 <w:webHidden/>
               </w:rPr>
-              <w:instrText xml:space="preserve"> PAGEREF _Toc229777996 \h </w:instrText>
+              <w:instrText xml:space="preserve"> PAGEREF _Toc229823817 \h </w:instrText>
             </w:r>
             <w:r>
               <w:rPr>
@@ -1480,14 +1482,7 @@
                 <w:noProof/>
                 <w:webHidden/>
               </w:rPr>
-              <w:t>1</w:t>
-            </w:r>
-            <w:r>
-              <w:rPr>
-                <w:noProof/>
-                <w:webHidden/>
-              </w:rPr>
-              <w:t>0</w:t>
+              <w:t>11</w:t>
             </w:r>
             <w:r>
               <w:rPr>
@@ -1500,7 +1495,7 @@
         </w:p>
         <w:p>
           <w:pPr>
-            <w:pStyle w:val="TOC1"/>
+            <w:pStyle w:val="TOC2"/>
             <w:tabs>
               <w:tab w:val="right" w:leader="dot" w:pos="9016"/>
             </w:tabs>
@@ -1512,13 +1507,13 @@
               <w:lang w:eastAsia="en-GB"/>
             </w:rPr>
           </w:pPr>
-          <w:hyperlink w:anchor="_Toc229777997" w:history="1">
+          <w:hyperlink w:anchor="_Toc229823818" w:history="1">
             <w:r>
               <w:rPr>
                 <w:rStyle w:val="Hyperlink"/>
                 <w:noProof/>
               </w:rPr>
-              <w:t>Adding Functionality</w:t>
+              <w:t>New Packages</w:t>
             </w:r>
             <w:r>
               <w:rPr>
@@ -1539,151 +1534,7 @@
                 <w:noProof/>
                 <w:webHidden/>
               </w:rPr>
-              <w:instrText xml:space="preserve"> PAGEREF _Toc229777997 \h </w:instrText>
-            </w:r>
-            <w:r>
-              <w:rPr>
-                <w:noProof/>
-                <w:webHidden/>
-              </w:rPr>
-            </w:r>
-            <w:r>
-              <w:rPr>
-                <w:noProof/>
-                <w:webHidden/>
-              </w:rPr>
-              <w:fldChar w:fldCharType="separate"/>
-            </w:r>
-            <w:r>
-              <w:rPr>
-                <w:noProof/>
-                <w:webHidden/>
-              </w:rPr>
-              <w:t>11</w:t>
-            </w:r>
-            <w:r>
-              <w:rPr>
-                <w:noProof/>
-                <w:webHidden/>
-              </w:rPr>
-              <w:fldChar w:fldCharType="end"/>
-            </w:r>
-          </w:hyperlink>
-        </w:p>
-        <w:p>
-          <w:pPr>
-            <w:pStyle w:val="TOC2"/>
-            <w:tabs>
-              <w:tab w:val="right" w:leader="dot" w:pos="9016"/>
-            </w:tabs>
-            <w:rPr>
-              <w:rFonts w:eastAsiaTheme="minorEastAsia"/>
-              <w:noProof/>
-              <w:sz w:val="24"/>
-              <w:szCs w:val="24"/>
-              <w:lang w:eastAsia="en-GB"/>
-            </w:rPr>
-          </w:pPr>
-          <w:hyperlink w:anchor="_Toc229777998" w:history="1">
-            <w:r>
-              <w:rPr>
-                <w:rStyle w:val="Hyperlink"/>
-                <w:noProof/>
-              </w:rPr>
-              <w:t>Database Objects</w:t>
-            </w:r>
-            <w:r>
-              <w:rPr>
-                <w:noProof/>
-                <w:webHidden/>
-              </w:rPr>
-              <w:tab/>
-            </w:r>
-            <w:r>
-              <w:rPr>
-                <w:noProof/>
-                <w:webHidden/>
-              </w:rPr>
-              <w:fldChar w:fldCharType="begin"/>
-            </w:r>
-            <w:r>
-              <w:rPr>
-                <w:noProof/>
-                <w:webHidden/>
-              </w:rPr>
-              <w:instrText xml:space="preserve"> PAGEREF _Toc229777998 \h </w:instrText>
-            </w:r>
-            <w:r>
-              <w:rPr>
-                <w:noProof/>
-                <w:webHidden/>
-              </w:rPr>
-            </w:r>
-            <w:r>
-              <w:rPr>
-                <w:noProof/>
-                <w:webHidden/>
-              </w:rPr>
-              <w:fldChar w:fldCharType="separate"/>
-            </w:r>
-            <w:r>
-              <w:rPr>
-                <w:noProof/>
-                <w:webHidden/>
-              </w:rPr>
-              <w:t>11</w:t>
-            </w:r>
-            <w:r>
-              <w:rPr>
-                <w:noProof/>
-                <w:webHidden/>
-              </w:rPr>
-              <w:fldChar w:fldCharType="end"/>
-            </w:r>
-          </w:hyperlink>
-        </w:p>
-        <w:p>
-          <w:pPr>
-            <w:pStyle w:val="TOC2"/>
-            <w:tabs>
-              <w:tab w:val="right" w:leader="dot" w:pos="9016"/>
-            </w:tabs>
-            <w:rPr>
-              <w:rFonts w:eastAsiaTheme="minorEastAsia"/>
-              <w:noProof/>
-              <w:sz w:val="24"/>
-              <w:szCs w:val="24"/>
-              <w:lang w:eastAsia="en-GB"/>
-            </w:rPr>
-          </w:pPr>
-          <w:hyperlink w:anchor="_Toc229777999" w:history="1">
-            <w:r>
-              <w:rPr>
-                <w:rStyle w:val="Hyperlink"/>
-                <w:noProof/>
-              </w:rPr>
-              <w:t>New Packages</w:t>
-            </w:r>
-            <w:r>
-              <w:rPr>
-                <w:noProof/>
-                <w:webHidden/>
-              </w:rPr>
-              <w:tab/>
-            </w:r>
-            <w:r>
-              <w:rPr>
-                <w:noProof/>
-                <w:webHidden/>
-              </w:rPr>
-              <w:fldChar w:fldCharType="begin"/>
-            </w:r>
-            <w:r>
-              <w:rPr>
-                <w:noProof/>
-                <w:webHidden/>
-              </w:rPr>
-              <w:instrText xml:space="preserve"> PAGEREF _Toc229777999 \h </w:instrText>
+              <w:instrText xml:space="preserve"> PAGEREF _Toc229823818 \h </w:instrText>
             </w:r>
             <w:r>
               <w:rPr>
@@ -1735,7 +1586,7 @@
       <w:pPr>
         <w:pStyle w:val="Heading1"/>
       </w:pPr>
-      <w:bookmarkStart w:id="0" w:name="_Toc229777981"/>
+      <w:bookmarkStart w:id="0" w:name="_Toc229823802"/>
       <w:r>
         <w:lastRenderedPageBreak/>
         <w:t>Introduction</w:t>
@@ -1801,7 +1652,7 @@
       <w:pPr>
         <w:pStyle w:val="Heading1"/>
       </w:pPr>
-      <w:bookmarkStart w:id="1" w:name="_Toc229777982"/>
+      <w:bookmarkStart w:id="1" w:name="_Toc229823803"/>
       <w:r>
         <w:lastRenderedPageBreak/>
         <w:t>Programming</w:t>
@@ -1817,7 +1668,7 @@
       <w:pPr>
         <w:pStyle w:val="Heading2"/>
       </w:pPr>
-      <w:bookmarkStart w:id="3" w:name="_Toc229777983"/>
+      <w:bookmarkStart w:id="3" w:name="_Toc229823804"/>
       <w:r>
         <w:t>Golden Rules for Software Development</w:t>
       </w:r>
@@ -1957,7 +1808,7 @@
       <w:pPr>
         <w:pStyle w:val="Heading2"/>
       </w:pPr>
-      <w:bookmarkStart w:id="7" w:name="_Toc229777984"/>
+      <w:bookmarkStart w:id="7" w:name="_Toc229823805"/>
       <w:r>
         <w:lastRenderedPageBreak/>
         <w:t>Naming Conventions</w:t>
@@ -2044,7 +1895,7 @@
       <w:pPr>
         <w:pStyle w:val="Heading3"/>
       </w:pPr>
-      <w:bookmarkStart w:id="8" w:name="_Toc229777985"/>
+      <w:bookmarkStart w:id="8" w:name="_Toc229823806"/>
       <w:r>
         <w:t>File Names</w:t>
       </w:r>
@@ -2085,9 +1936,11 @@
               <w:t>packagename</w:t>
             </w:r>
             <w:proofErr w:type="spellEnd"/>
+            <w:proofErr w:type="gramStart"/>
             <w:r>
               <w:t>&gt;.pks</w:t>
             </w:r>
+            <w:proofErr w:type="gramEnd"/>
           </w:p>
         </w:tc>
       </w:tr>
@@ -2115,6 +1968,7 @@
               <w:t>packagename</w:t>
             </w:r>
             <w:proofErr w:type="spellEnd"/>
+            <w:proofErr w:type="gramStart"/>
             <w:r>
               <w:t>&gt;.</w:t>
             </w:r>
@@ -2123,6 +1977,7 @@
               <w:t>pkb</w:t>
             </w:r>
             <w:proofErr w:type="spellEnd"/>
+            <w:proofErr w:type="gramEnd"/>
           </w:p>
         </w:tc>
       </w:tr>
@@ -2150,6 +2005,7 @@
               <w:t>libraryname</w:t>
             </w:r>
             <w:proofErr w:type="spellEnd"/>
+            <w:proofErr w:type="gramStart"/>
             <w:r>
               <w:t>&gt;.</w:t>
             </w:r>
@@ -2158,22 +2014,33 @@
               <w:t>pll</w:t>
             </w:r>
             <w:proofErr w:type="spellEnd"/>
-            <w:r>
-              <w:t xml:space="preserve">   .</w:t>
+            <w:proofErr w:type="gramEnd"/>
+            <w:r>
+              <w:t xml:space="preserve"> </w:t>
+            </w:r>
+            <w:proofErr w:type="gramStart"/>
+            <w:r>
+              <w:t xml:space="preserve">  .</w:t>
             </w:r>
             <w:proofErr w:type="spellStart"/>
             <w:r>
               <w:t>plx</w:t>
             </w:r>
             <w:proofErr w:type="spellEnd"/>
-            <w:r>
-              <w:t xml:space="preserve">   .</w:t>
+            <w:proofErr w:type="gramEnd"/>
+            <w:r>
+              <w:t xml:space="preserve"> </w:t>
+            </w:r>
+            <w:proofErr w:type="gramStart"/>
+            <w:r>
+              <w:t xml:space="preserve">  .</w:t>
             </w:r>
             <w:proofErr w:type="spellStart"/>
             <w:r>
               <w:t>pld</w:t>
             </w:r>
             <w:proofErr w:type="spellEnd"/>
+            <w:proofErr w:type="gramEnd"/>
           </w:p>
         </w:tc>
       </w:tr>
@@ -2194,8 +2061,13 @@
           </w:tcPr>
           <w:p>
             <w:r>
-              <w:t>&lt;name&gt;.pls</w:t>
-            </w:r>
+              <w:t>&lt;name</w:t>
+            </w:r>
+            <w:proofErr w:type="gramStart"/>
+            <w:r>
+              <w:t>&gt;.pls</w:t>
+            </w:r>
+            <w:proofErr w:type="gramEnd"/>
           </w:p>
         </w:tc>
       </w:tr>
@@ -2244,7 +2116,7 @@
         <w:pStyle w:val="Heading3"/>
       </w:pPr>
       <w:bookmarkStart w:id="9" w:name="_Toc80305903"/>
-      <w:bookmarkStart w:id="10" w:name="_Toc229777986"/>
+      <w:bookmarkStart w:id="10" w:name="_Toc229823807"/>
       <w:r>
         <w:t>Database Objects</w:t>
       </w:r>
@@ -2592,7 +2464,7 @@
         <w:pStyle w:val="Heading3"/>
       </w:pPr>
       <w:bookmarkStart w:id="11" w:name="_Toc80305904"/>
-      <w:bookmarkStart w:id="12" w:name="_Toc229777987"/>
+      <w:bookmarkStart w:id="12" w:name="_Toc229823808"/>
       <w:r>
         <w:lastRenderedPageBreak/>
         <w:t>PL/SQL Variables and Identifiers</w:t>
@@ -2884,24 +2756,22 @@
     </w:tbl>
     <w:p/>
     <w:p/>
-    <w:bookmarkStart w:id="13" w:name="_Toc229777988" w:displacedByCustomXml="next"/>
+    <w:bookmarkStart w:id="13" w:name="_Toc229823809" w:displacedByCustomXml="next"/>
     <w:bookmarkStart w:id="14" w:name="_Toc229766042" w:displacedByCustomXml="next"/>
     <w:sdt>
       <w:sdtPr>
+        <w:rPr>
+          <w:rFonts w:asciiTheme="minorHAnsi" w:eastAsiaTheme="minorHAnsi" w:hAnsiTheme="minorHAnsi" w:cstheme="minorBidi"/>
+          <w:color w:val="auto"/>
+          <w:sz w:val="22"/>
+          <w:szCs w:val="22"/>
+        </w:rPr>
         <w:id w:val="648102963"/>
         <w:docPartObj>
           <w:docPartGallery w:val="Cover Pages"/>
           <w:docPartUnique/>
         </w:docPartObj>
       </w:sdtPr>
-      <w:sdtEndPr>
-        <w:rPr>
-          <w:rFonts w:asciiTheme="minorHAnsi" w:eastAsiaTheme="minorHAnsi" w:hAnsiTheme="minorHAnsi" w:cstheme="minorBidi"/>
-          <w:color w:val="auto"/>
-          <w:sz w:val="22"/>
-          <w:szCs w:val="22"/>
-        </w:rPr>
-      </w:sdtEndPr>
       <w:sdtContent>
         <w:bookmarkStart w:id="15" w:name="_Toc80305907" w:displacedByCustomXml="prev"/>
         <w:p>
@@ -3047,7 +2917,7 @@
           </w:pPr>
           <w:bookmarkStart w:id="19" w:name="_PL/SQL_Programming_Tips_1"/>
           <w:bookmarkStart w:id="20" w:name="_Toc229766043"/>
-          <w:bookmarkStart w:id="21" w:name="_Toc229777989"/>
+          <w:bookmarkStart w:id="21" w:name="_Toc229823810"/>
           <w:bookmarkEnd w:id="19"/>
           <w:r>
             <w:lastRenderedPageBreak/>
@@ -3268,11 +3138,11 @@
         </w:p>
         <w:p>
           <w:pPr>
-            <w:pStyle w:val="Heading2"/>
+            <w:pStyle w:val="Heading3"/>
           </w:pPr>
           <w:bookmarkStart w:id="22" w:name="_Toc80305909"/>
           <w:bookmarkStart w:id="23" w:name="_Toc229766044"/>
-          <w:bookmarkStart w:id="24" w:name="_Toc229777990"/>
+          <w:bookmarkStart w:id="24" w:name="_Toc229823811"/>
           <w:r>
             <w:lastRenderedPageBreak/>
             <w:t>Packages</w:t>
@@ -3386,14 +3256,14 @@
         </w:p>
         <w:p>
           <w:pPr>
-            <w:pStyle w:val="Heading2"/>
+            <w:pStyle w:val="Heading3"/>
             <w:rPr>
               <w:rStyle w:val="Heading4Char"/>
             </w:rPr>
           </w:pPr>
           <w:bookmarkStart w:id="25" w:name="_Toc80305910"/>
           <w:bookmarkStart w:id="26" w:name="_Toc229766045"/>
-          <w:bookmarkStart w:id="27" w:name="_Toc229777991"/>
+          <w:bookmarkStart w:id="27" w:name="_Toc229823812"/>
           <w:r>
             <w:t>Functions</w:t>
           </w:r>
@@ -3491,12 +3361,21 @@
             <w:t xml:space="preserve">SELECT </w:t>
           </w:r>
           <w:proofErr w:type="spellStart"/>
-          <w:r>
-            <w:rPr>
-              <w:rFonts w:ascii="Courier New" w:hAnsi="Courier New" w:cs="Courier New"/>
-              <w:b/>
-            </w:rPr>
-            <w:t>employee.first_name</w:t>
+          <w:proofErr w:type="gramStart"/>
+          <w:r>
+            <w:rPr>
+              <w:rFonts w:ascii="Courier New" w:hAnsi="Courier New" w:cs="Courier New"/>
+              <w:b/>
+            </w:rPr>
+            <w:t>employee.first</w:t>
+          </w:r>
+          <w:proofErr w:type="gramEnd"/>
+          <w:r>
+            <w:rPr>
+              <w:rFonts w:ascii="Courier New" w:hAnsi="Courier New" w:cs="Courier New"/>
+              <w:b/>
+            </w:rPr>
+            <w:t>_name</w:t>
           </w:r>
           <w:proofErr w:type="spellEnd"/>
           <w:r>
@@ -3504,15 +3383,40 @@
               <w:rFonts w:ascii="Courier New" w:hAnsi="Courier New" w:cs="Courier New"/>
               <w:b/>
             </w:rPr>
-            <w:t xml:space="preserve"> || ‘ ‘ || </w:t>
+            <w:t xml:space="preserve"> || </w:t>
+          </w:r>
+          <w:proofErr w:type="gramStart"/>
+          <w:r>
+            <w:rPr>
+              <w:rFonts w:ascii="Courier New" w:hAnsi="Courier New" w:cs="Courier New"/>
+              <w:b/>
+            </w:rPr>
+            <w:t>‘ ‘</w:t>
+          </w:r>
+          <w:proofErr w:type="gramEnd"/>
+          <w:r>
+            <w:rPr>
+              <w:rFonts w:ascii="Courier New" w:hAnsi="Courier New" w:cs="Courier New"/>
+              <w:b/>
+            </w:rPr>
+            <w:t xml:space="preserve"> || </w:t>
           </w:r>
           <w:proofErr w:type="spellStart"/>
-          <w:r>
-            <w:rPr>
-              <w:rFonts w:ascii="Courier New" w:hAnsi="Courier New" w:cs="Courier New"/>
-              <w:b/>
-            </w:rPr>
-            <w:t>employee.last_name</w:t>
+          <w:proofErr w:type="gramStart"/>
+          <w:r>
+            <w:rPr>
+              <w:rFonts w:ascii="Courier New" w:hAnsi="Courier New" w:cs="Courier New"/>
+              <w:b/>
+            </w:rPr>
+            <w:t>employee.last</w:t>
+          </w:r>
+          <w:proofErr w:type="gramEnd"/>
+          <w:r>
+            <w:rPr>
+              <w:rFonts w:ascii="Courier New" w:hAnsi="Courier New" w:cs="Courier New"/>
+              <w:b/>
+            </w:rPr>
+            <w:t>_name</w:t>
           </w:r>
           <w:proofErr w:type="spellEnd"/>
         </w:p>
@@ -3609,9 +3513,18 @@
               <w:rFonts w:ascii="Courier New" w:hAnsi="Courier New" w:cs="Courier New"/>
               <w:b/>
             </w:rPr>
-            <w:t>employee_rp.fullname</w:t>
+            <w:t>employee_</w:t>
+          </w:r>
+          <w:proofErr w:type="gramStart"/>
+          <w:r>
+            <w:rPr>
+              <w:rFonts w:ascii="Courier New" w:hAnsi="Courier New" w:cs="Courier New"/>
+              <w:b/>
+            </w:rPr>
+            <w:t>rp.fullname</w:t>
           </w:r>
           <w:proofErr w:type="spellEnd"/>
+          <w:proofErr w:type="gramEnd"/>
           <w:r>
             <w:rPr>
               <w:rFonts w:ascii="Courier New" w:hAnsi="Courier New" w:cs="Courier New"/>
@@ -3728,9 +3641,18 @@
               <w:rFonts w:cs="Calibri"/>
               <w:i/>
             </w:rPr>
-            <w:t>employee_rp.fullname</w:t>
+            <w:t>employee_</w:t>
+          </w:r>
+          <w:proofErr w:type="gramStart"/>
+          <w:r>
+            <w:rPr>
+              <w:rFonts w:cs="Calibri"/>
+              <w:i/>
+            </w:rPr>
+            <w:t>rp.fullname</w:t>
           </w:r>
           <w:proofErr w:type="spellEnd"/>
+          <w:proofErr w:type="gramEnd"/>
           <w:r>
             <w:rPr>
               <w:rFonts w:cs="Calibri"/>
@@ -3868,6 +3790,7 @@
             <w:rPr>
               <w:rFonts w:cs="Calibri"/>
             </w:rPr>
+            <w:lastRenderedPageBreak/>
             <w:t xml:space="preserve">You would just need to alter the </w:t>
           </w:r>
           <w:proofErr w:type="spellStart"/>
@@ -3875,9 +3798,17 @@
             <w:rPr>
               <w:rFonts w:cs="Calibri"/>
             </w:rPr>
-            <w:t>employee_rp.fullname</w:t>
+            <w:t>employee_</w:t>
+          </w:r>
+          <w:proofErr w:type="gramStart"/>
+          <w:r>
+            <w:rPr>
+              <w:rFonts w:cs="Calibri"/>
+            </w:rPr>
+            <w:t>rp.fullname</w:t>
           </w:r>
           <w:proofErr w:type="spellEnd"/>
+          <w:proofErr w:type="gramEnd"/>
           <w:r>
             <w:rPr>
               <w:rFonts w:cs="Calibri"/>
@@ -3906,14 +3837,14 @@
         </w:p>
         <w:p>
           <w:pPr>
-            <w:pStyle w:val="Heading2"/>
+            <w:pStyle w:val="Heading3"/>
             <w:rPr>
               <w:rFonts w:ascii="Calibri" w:hAnsi="Calibri"/>
             </w:rPr>
           </w:pPr>
           <w:bookmarkStart w:id="28" w:name="_Toc80305911"/>
           <w:bookmarkStart w:id="29" w:name="_Toc229766046"/>
-          <w:bookmarkStart w:id="30" w:name="_Toc229777992"/>
+          <w:bookmarkStart w:id="30" w:name="_Toc229823813"/>
           <w:r>
             <w:t>Data Typing</w:t>
           </w:r>
@@ -4064,12 +3995,21 @@
             <w:tab/>
           </w:r>
           <w:proofErr w:type="spellStart"/>
-          <w:r>
-            <w:rPr>
-              <w:rFonts w:ascii="Courier New" w:hAnsi="Courier New" w:cs="Courier New"/>
-              <w:b/>
-            </w:rPr>
-            <w:t>emp.employee_name%TYPE</w:t>
+          <w:proofErr w:type="gramStart"/>
+          <w:r>
+            <w:rPr>
+              <w:rFonts w:ascii="Courier New" w:hAnsi="Courier New" w:cs="Courier New"/>
+              <w:b/>
+            </w:rPr>
+            <w:t>emp.employee</w:t>
+          </w:r>
+          <w:proofErr w:type="gramEnd"/>
+          <w:r>
+            <w:rPr>
+              <w:rFonts w:ascii="Courier New" w:hAnsi="Courier New" w:cs="Courier New"/>
+              <w:b/>
+            </w:rPr>
+            <w:t>_name%TYPE</w:t>
           </w:r>
           <w:proofErr w:type="spellEnd"/>
           <w:r>
@@ -4100,11 +4040,11 @@
         </w:p>
         <w:p>
           <w:pPr>
-            <w:pStyle w:val="Heading2"/>
+            <w:pStyle w:val="Heading3"/>
           </w:pPr>
           <w:bookmarkStart w:id="31" w:name="_Toc80305912"/>
           <w:bookmarkStart w:id="32" w:name="_Toc229766047"/>
-          <w:bookmarkStart w:id="33" w:name="_Toc229777993"/>
+          <w:bookmarkStart w:id="33" w:name="_Toc229823814"/>
           <w:r>
             <w:t>Performance</w:t>
           </w:r>
@@ -4119,16 +4059,22 @@
         </w:p>
         <w:p>
           <w:pPr>
-            <w:pStyle w:val="Heading3"/>
+            <w:pStyle w:val="Heading4"/>
             <w:rPr>
               <w:rFonts w:ascii="Calibri" w:hAnsi="Calibri"/>
             </w:rPr>
           </w:pPr>
-          <w:bookmarkStart w:id="34" w:name="_Toc229777994"/>
-          <w:r>
-            <w:t>Bulk Collect versus Cursor For Loops</w:t>
-          </w:r>
-          <w:bookmarkEnd w:id="34"/>
+          <w:r>
+            <w:t xml:space="preserve">Bulk Collect versus Cursor </w:t>
+          </w:r>
+          <w:proofErr w:type="gramStart"/>
+          <w:r>
+            <w:t>For</w:t>
+          </w:r>
+          <w:proofErr w:type="gramEnd"/>
+          <w:r>
+            <w:t xml:space="preserve"> Loops</w:t>
+          </w:r>
         </w:p>
         <w:p>
           <w:pPr>
@@ -4159,7 +4105,21 @@
             <w:rPr>
               <w:rFonts w:cs="Calibri"/>
             </w:rPr>
-            <w:t xml:space="preserve"> use a Cursor For Loop for a single row query.</w:t>
+            <w:t xml:space="preserve"> use a Cursor </w:t>
+          </w:r>
+          <w:proofErr w:type="gramStart"/>
+          <w:r>
+            <w:rPr>
+              <w:rFonts w:cs="Calibri"/>
+            </w:rPr>
+            <w:t>For</w:t>
+          </w:r>
+          <w:proofErr w:type="gramEnd"/>
+          <w:r>
+            <w:rPr>
+              <w:rFonts w:cs="Calibri"/>
+            </w:rPr>
+            <w:t xml:space="preserve"> Loop for a single row query.</w:t>
           </w:r>
         </w:p>
         <w:p>
@@ -4235,17 +4195,15 @@
         </w:p>
         <w:p>
           <w:pPr>
-            <w:pStyle w:val="Heading3"/>
+            <w:pStyle w:val="Heading4"/>
           </w:pPr>
           <w:r>
             <w:br w:type="page"/>
           </w:r>
-          <w:bookmarkStart w:id="35" w:name="_Toc229777995"/>
           <w:r>
             <w:lastRenderedPageBreak/>
             <w:t>Cursors</w:t>
           </w:r>
-          <w:bookmarkEnd w:id="35"/>
         </w:p>
         <w:p>
           <w:pPr>
@@ -4291,12 +4249,21 @@
             <w:t xml:space="preserve">SELECT </w:t>
           </w:r>
           <w:proofErr w:type="spellStart"/>
-          <w:r>
-            <w:rPr>
-              <w:rFonts w:ascii="Courier New" w:hAnsi="Courier New" w:cs="Courier New"/>
-              <w:b/>
-            </w:rPr>
-            <w:t>employee.last_name</w:t>
+          <w:proofErr w:type="gramStart"/>
+          <w:r>
+            <w:rPr>
+              <w:rFonts w:ascii="Courier New" w:hAnsi="Courier New" w:cs="Courier New"/>
+              <w:b/>
+            </w:rPr>
+            <w:t>employee.last</w:t>
+          </w:r>
+          <w:proofErr w:type="gramEnd"/>
+          <w:r>
+            <w:rPr>
+              <w:rFonts w:ascii="Courier New" w:hAnsi="Courier New" w:cs="Courier New"/>
+              <w:b/>
+            </w:rPr>
+            <w:t>_name</w:t>
           </w:r>
           <w:proofErr w:type="spellEnd"/>
         </w:p>
@@ -4835,12 +4802,12 @@
       <w:pPr>
         <w:pStyle w:val="Heading1"/>
       </w:pPr>
-      <w:bookmarkStart w:id="36" w:name="_Toc229777996"/>
+      <w:bookmarkStart w:id="34" w:name="_Toc229823815"/>
       <w:r>
         <w:lastRenderedPageBreak/>
         <w:t>Version Control</w:t>
       </w:r>
-      <w:bookmarkEnd w:id="36"/>
+      <w:bookmarkEnd w:id="34"/>
     </w:p>
     <w:p/>
     <w:p>
@@ -4927,7 +4894,11 @@
     <w:p/>
     <w:p>
       <w:r>
-        <w:t xml:space="preserve">SQL Developer is integrated with Git, so you can </w:t>
+        <w:t xml:space="preserve">SQL Developer is integrated with Git, so you </w:t>
+      </w:r>
+      <w:proofErr w:type="gramStart"/>
+      <w:r>
+        <w:t xml:space="preserve">can </w:t>
       </w:r>
       <w:r>
         <w:t xml:space="preserve"> </w:t>
@@ -4937,6 +4908,7 @@
         <w:t>user</w:t>
       </w:r>
       <w:proofErr w:type="spellEnd"/>
+      <w:proofErr w:type="gramEnd"/>
       <w:r>
         <w:t xml:space="preserve"> it </w:t>
       </w:r>
@@ -4964,23 +4936,23 @@
       <w:pPr>
         <w:pStyle w:val="Heading1"/>
       </w:pPr>
-      <w:bookmarkStart w:id="37" w:name="_Toc229777997"/>
+      <w:bookmarkStart w:id="35" w:name="_Toc229823816"/>
       <w:r>
         <w:lastRenderedPageBreak/>
         <w:t>Adding Functionality</w:t>
       </w:r>
-      <w:bookmarkEnd w:id="37"/>
+      <w:bookmarkEnd w:id="35"/>
     </w:p>
     <w:p/>
     <w:p>
       <w:pPr>
         <w:pStyle w:val="Heading2"/>
       </w:pPr>
-      <w:bookmarkStart w:id="38" w:name="_Toc229777998"/>
+      <w:bookmarkStart w:id="36" w:name="_Toc229823817"/>
       <w:r>
         <w:t>Database Objects</w:t>
       </w:r>
-      <w:bookmarkEnd w:id="38"/>
+      <w:bookmarkEnd w:id="36"/>
     </w:p>
     <w:p>
       <w:pPr>
@@ -5019,11 +4991,11 @@
       <w:pPr>
         <w:pStyle w:val="Heading2"/>
       </w:pPr>
-      <w:bookmarkStart w:id="39" w:name="_Toc229777999"/>
+      <w:bookmarkStart w:id="37" w:name="_Toc229823818"/>
       <w:r>
         <w:t>New Packages</w:t>
       </w:r>
-      <w:bookmarkEnd w:id="39"/>
+      <w:bookmarkEnd w:id="37"/>
     </w:p>
     <w:p/>
     <w:p>
@@ -5046,24 +5018,26 @@
         <w:t xml:space="preserve"> folder. </w:t>
       </w:r>
       <w:hyperlink r:id="rId10" w:history="1">
+        <w:proofErr w:type="gramStart"/>
         <w:r>
           <w:rPr>
             <w:rStyle w:val="Hyperlink"/>
           </w:rPr>
-          <w:t>..\</w:t>
+          <w:t>..</w:t>
+        </w:r>
+        <w:proofErr w:type="gramEnd"/>
+        <w:r>
+          <w:rPr>
+            <w:rStyle w:val="Hyperlink"/>
+          </w:rPr>
+          <w:t>\</w:t>
         </w:r>
         <w:proofErr w:type="spellStart"/>
         <w:r>
           <w:rPr>
             <w:rStyle w:val="Hyperlink"/>
           </w:rPr>
-          <w:t>plsq</w:t>
-        </w:r>
-        <w:r>
-          <w:rPr>
-            <w:rStyle w:val="Hyperlink"/>
-          </w:rPr>
-          <w:t>l</w:t>
+          <w:t>plsql</w:t>
         </w:r>
         <w:proofErr w:type="spellEnd"/>
       </w:hyperlink>
@@ -5115,13 +5089,7 @@
           <w:rPr>
             <w:rStyle w:val="Hyperlink"/>
           </w:rPr>
-          <w:t>compile_packages.sq</w:t>
-        </w:r>
-        <w:r>
-          <w:rPr>
-            <w:rStyle w:val="Hyperlink"/>
-          </w:rPr>
-          <w:t>l</w:t>
+          <w:t>compile_packages.sql</w:t>
         </w:r>
         <w:proofErr w:type="spellEnd"/>
       </w:hyperlink>
@@ -5147,7 +5115,15 @@
         </w:numPr>
       </w:pPr>
       <w:r>
-        <w:t>Grant execute privileges to the connect user</w:t>
+        <w:t xml:space="preserve">Grant </w:t>
+      </w:r>
+      <w:proofErr w:type="gramStart"/>
+      <w:r>
+        <w:t>execute</w:t>
+      </w:r>
+      <w:proofErr w:type="gramEnd"/>
+      <w:r>
+        <w:t xml:space="preserve"> privileges to the connect user</w:t>
       </w:r>
     </w:p>
     <w:p>
@@ -7798,8 +7774,11 @@
   <w:rsids>
     <w:rsidRoot w:val="00937DE4"/>
     <w:rsid w:val="000426CE"/>
+    <w:rsid w:val="000775F1"/>
     <w:rsid w:val="00605437"/>
     <w:rsid w:val="00937DE4"/>
+    <w:rsid w:val="00B25DFA"/>
+    <w:rsid w:val="00CB64DC"/>
   </w:rsids>
   <m:mathPr>
     <m:mathFont m:val="Cambria Math"/>

</xml_diff>